<commit_message>
Fix dates calculation. Add batch generation by providing directory path
</commit_message>
<xml_diff>
--- a/templates/plan.docx
+++ b/templates/plan.docx
@@ -114,7 +114,122 @@
           <w:szCs w:val="28"/>
           <w:rtl w:val="0"/>
         </w:rPr>
+        <w:t xml:space="preserve">{%p if not individual_student_name_gent %}</w:t>
+      </w:r>
+    </w:p>
+    <w:p>
+      <w:pPr>
+        <w:jc w:val="center"/>
+        <w:rPr>
+          <w:rFonts w:ascii="Times New Roman" w:cs="Times New Roman" w:eastAsia="Times New Roman" w:hAnsi="Times New Roman"/>
+          <w:b w:val="1"/>
+          <w:bCs w:val="1"/>
+          <w:sz w:val="28"/>
+          <w:szCs w:val="28"/>
+        </w:rPr>
+      </w:pPr>
+      <w:r>
+        <w:rPr>
+          <w:rFonts w:ascii="Times New Roman" w:cs="Times New Roman" w:eastAsia="Times New Roman" w:hAnsi="Times New Roman"/>
+          <w:b w:val="1"/>
+          <w:bCs w:val="1"/>
+          <w:sz w:val="28"/>
+          <w:szCs w:val="28"/>
+          <w:rtl w:val="0"/>
+        </w:rPr>
         <w:t xml:space="preserve">для учнів {{ class_name | upper }} класу</w:t>
+      </w:r>
+    </w:p>
+    <w:p>
+      <w:pPr>
+        <w:jc w:val="center"/>
+        <w:rPr>
+          <w:rFonts w:ascii="Times New Roman" w:cs="Times New Roman" w:eastAsia="Times New Roman" w:hAnsi="Times New Roman"/>
+          <w:b w:val="1"/>
+          <w:bCs w:val="1"/>
+          <w:sz w:val="28"/>
+          <w:szCs w:val="28"/>
+        </w:rPr>
+      </w:pPr>
+      <w:r>
+        <w:rPr>
+          <w:rFonts w:ascii="Times New Roman" w:cs="Times New Roman" w:eastAsia="Times New Roman" w:hAnsi="Times New Roman"/>
+          <w:b w:val="1"/>
+          <w:bCs w:val="1"/>
+          <w:sz w:val="28"/>
+          <w:szCs w:val="28"/>
+          <w:rtl w:val="0"/>
+        </w:rPr>
+        <w:t xml:space="preserve">{%p endif %}</w:t>
+      </w:r>
+    </w:p>
+    <w:p>
+      <w:pPr>
+        <w:jc w:val="center"/>
+        <w:rPr>
+          <w:rFonts w:ascii="Times New Roman" w:cs="Times New Roman" w:eastAsia="Times New Roman" w:hAnsi="Times New Roman"/>
+          <w:b w:val="1"/>
+          <w:bCs w:val="1"/>
+          <w:sz w:val="28"/>
+          <w:szCs w:val="28"/>
+        </w:rPr>
+      </w:pPr>
+      <w:r>
+        <w:rPr>
+          <w:rFonts w:ascii="Times New Roman" w:cs="Times New Roman" w:eastAsia="Times New Roman" w:hAnsi="Times New Roman"/>
+          <w:b w:val="1"/>
+          <w:bCs w:val="1"/>
+          <w:sz w:val="28"/>
+          <w:szCs w:val="28"/>
+          <w:rtl w:val="0"/>
+        </w:rPr>
+        <w:t xml:space="preserve">{%p if individual_student_name_gent %}</w:t>
+      </w:r>
+    </w:p>
+    <w:p>
+      <w:pPr>
+        <w:jc w:val="center"/>
+        <w:rPr>
+          <w:rFonts w:ascii="Times New Roman" w:cs="Times New Roman" w:eastAsia="Times New Roman" w:hAnsi="Times New Roman"/>
+          <w:b w:val="1"/>
+          <w:bCs w:val="1"/>
+          <w:sz w:val="28"/>
+          <w:szCs w:val="28"/>
+        </w:rPr>
+      </w:pPr>
+      <w:r>
+        <w:rPr>
+          <w:rFonts w:ascii="Times New Roman" w:cs="Times New Roman" w:eastAsia="Times New Roman" w:hAnsi="Times New Roman"/>
+          <w:b w:val="1"/>
+          <w:bCs w:val="1"/>
+          <w:sz w:val="28"/>
+          <w:szCs w:val="28"/>
+          <w:rtl w:val="0"/>
+        </w:rPr>
+        <w:t xml:space="preserve">для учня {{ individual_student_name_gent }}</w:t>
+      </w:r>
+    </w:p>
+    <w:p>
+      <w:pPr>
+        <w:jc w:val="center"/>
+        <w:rPr>
+          <w:rFonts w:ascii="Times New Roman" w:cs="Times New Roman" w:eastAsia="Times New Roman" w:hAnsi="Times New Roman"/>
+          <w:b w:val="1"/>
+          <w:bCs w:val="1"/>
+          <w:sz w:val="28"/>
+          <w:szCs w:val="28"/>
+        </w:rPr>
+      </w:pPr>
+      <w:r>
+        <w:rPr>
+          <w:rFonts w:ascii="Times New Roman" w:cs="Times New Roman" w:eastAsia="Times New Roman" w:hAnsi="Times New Roman"/>
+          <w:b w:val="1"/>
+          <w:bCs w:val="1"/>
+          <w:sz w:val="28"/>
+          <w:szCs w:val="28"/>
+          <w:rtl w:val="0"/>
+        </w:rPr>
+        <w:t xml:space="preserve">{%p endif %}</w:t>
       </w:r>
     </w:p>
     <w:p>
@@ -694,16 +809,6 @@
     <w:p>
       <w:pPr>
         <w:rPr/>
-      </w:pPr>
-      <w:r>
-        <w:rPr>
-          <w:rtl w:val="0"/>
-        </w:rPr>
-      </w:r>
-    </w:p>
-    <w:p>
-      <w:pPr>
-        <w:rPr/>
         <w:sectPr>
           <w:pgSz w:h="15840" w:w="12240" w:orient="portrait"/>
           <w:pgMar w:bottom="1440" w:top="1440" w:left="1440" w:right="1440" w:header="720" w:footer="720"/>
@@ -1545,8 +1650,12 @@
       </w:pPr>
       <w:r>
         <w:rPr>
-          <w:rtl w:val="0"/>
-        </w:rPr>
+          <w:rFonts w:ascii="Times New Roman" w:cs="Times New Roman" w:eastAsia="Times New Roman" w:hAnsi="Times New Roman"/>
+          <w:sz w:val="24"/>
+          <w:szCs w:val="24"/>
+          <w:rtl w:val="0"/>
+        </w:rPr>
+        <w:t xml:space="preserve">{%p if textbooks %}</w:t>
       </w:r>
     </w:p>
     <w:p>
@@ -1852,8 +1961,12 @@
       </w:pPr>
       <w:r>
         <w:rPr>
-          <w:rtl w:val="0"/>
-        </w:rPr>
+          <w:rFonts w:ascii="Times New Roman" w:cs="Times New Roman" w:eastAsia="Times New Roman" w:hAnsi="Times New Roman"/>
+          <w:sz w:val="24"/>
+          <w:szCs w:val="24"/>
+          <w:rtl w:val="0"/>
+        </w:rPr>
+        <w:t xml:space="preserve">{%p endif %}</w:t>
       </w:r>
     </w:p>
     <w:p>
@@ -2048,7 +2161,7 @@
     <w:tbl>
       <w:tblPr>
         <w:tblStyle w:val="Table4"/>
-        <w:tblW w:w="10050.0" w:type="dxa"/>
+        <w:tblW w:w="9885.0" w:type="dxa"/>
         <w:jc w:val="left"/>
         <w:tblBorders>
           <w:top w:color="d9d9d9" w:space="0" w:sz="4" w:val="single"/>
@@ -2063,17 +2176,15 @@
       </w:tblPr>
       <w:tblGrid>
         <w:gridCol w:w="675"/>
-        <w:gridCol w:w="1134"/>
-        <w:gridCol w:w="5264"/>
-        <w:gridCol w:w="1559"/>
-        <w:gridCol w:w="1418"/>
+        <w:gridCol w:w="1560"/>
+        <w:gridCol w:w="4845"/>
+        <w:gridCol w:w="2805"/>
         <w:tblGridChange w:id="0">
           <w:tblGrid>
             <w:gridCol w:w="675"/>
-            <w:gridCol w:w="1134"/>
-            <w:gridCol w:w="5264"/>
-            <w:gridCol w:w="1559"/>
-            <w:gridCol w:w="1418"/>
+            <w:gridCol w:w="1560"/>
+            <w:gridCol w:w="4845"/>
+            <w:gridCol w:w="2805"/>
           </w:tblGrid>
         </w:tblGridChange>
       </w:tblGrid>
@@ -2210,42 +2321,6 @@
               <w:jc w:val="center"/>
               <w:rPr>
                 <w:rFonts w:ascii="Times New Roman" w:cs="Times New Roman" w:eastAsia="Times New Roman" w:hAnsi="Times New Roman"/>
-                <w:b w:val="1"/>
-                <w:bCs w:val="1"/>
-                <w:sz w:val="24"/>
-                <w:szCs w:val="24"/>
-              </w:rPr>
-            </w:pPr>
-            <w:r>
-              <w:rPr>
-                <w:rFonts w:ascii="Times New Roman" w:cs="Times New Roman" w:eastAsia="Times New Roman" w:hAnsi="Times New Roman"/>
-                <w:b w:val="1"/>
-                <w:bCs w:val="1"/>
-                <w:sz w:val="24"/>
-                <w:szCs w:val="24"/>
-                <w:rtl w:val="0"/>
-              </w:rPr>
-              <w:t xml:space="preserve">Групи результатів</w:t>
-            </w:r>
-          </w:p>
-        </w:tc>
-        <w:tc>
-          <w:tcPr>
-            <w:tcBorders>
-              <w:top w:color="d9d9d9" w:space="0" w:sz="4" w:val="single"/>
-              <w:left w:color="d9d9d9" w:space="0" w:sz="4" w:val="single"/>
-              <w:bottom w:color="d9d9d9" w:space="0" w:sz="4" w:val="single"/>
-              <w:right w:color="d9d9d9" w:space="0" w:sz="4" w:val="single"/>
-            </w:tcBorders>
-            <w:shd w:fill="bfbfbf" w:val="clear"/>
-            <w:vAlign w:val="center"/>
-          </w:tcPr>
-          <w:p>
-            <w:pPr>
-              <w:spacing w:line="240" w:lineRule="auto"/>
-              <w:jc w:val="center"/>
-              <w:rPr>
-                <w:rFonts w:ascii="Times New Roman" w:cs="Times New Roman" w:eastAsia="Times New Roman" w:hAnsi="Times New Roman"/>
                 <w:sz w:val="24"/>
                 <w:szCs w:val="24"/>
               </w:rPr>
@@ -2276,7 +2351,7 @@
         </w:trPr>
         <w:tc>
           <w:tcPr>
-            <w:gridSpan w:val="5"/>
+            <w:gridSpan w:val="4"/>
             <w:tcBorders>
               <w:top w:color="d9d9d9" w:space="0" w:sz="4" w:val="single"/>
               <w:left w:color="d9d9d9" w:space="0" w:sz="4" w:val="single"/>
@@ -2318,7 +2393,7 @@
         </w:trPr>
         <w:tc>
           <w:tcPr>
-            <w:gridSpan w:val="5"/>
+            <w:gridSpan w:val="4"/>
             <w:tcBorders>
               <w:top w:color="d9d9d9" w:space="0" w:sz="4" w:val="single"/>
               <w:left w:color="d9d9d9" w:space="0" w:sz="4" w:val="single"/>
@@ -2375,7 +2450,7 @@
         </w:trPr>
         <w:tc>
           <w:tcPr>
-            <w:gridSpan w:val="5"/>
+            <w:gridSpan w:val="4"/>
             <w:tcBorders>
               <w:top w:color="d9d9d9" w:space="0" w:sz="4" w:val="single"/>
               <w:left w:color="d9d9d9" w:space="0" w:sz="4" w:val="single"/>
@@ -2417,7 +2492,7 @@
         </w:trPr>
         <w:tc>
           <w:tcPr>
-            <w:gridSpan w:val="5"/>
+            <w:gridSpan w:val="4"/>
             <w:tcBorders>
               <w:top w:color="d9d9d9" w:space="0" w:sz="4" w:val="single"/>
               <w:left w:color="d9d9d9" w:space="0" w:sz="4" w:val="single"/>
@@ -2460,7 +2535,7 @@
         </w:trPr>
         <w:tc>
           <w:tcPr>
-            <w:gridSpan w:val="5"/>
+            <w:gridSpan w:val="4"/>
             <w:tcBorders>
               <w:top w:color="d9d9d9" w:space="0" w:sz="4" w:val="single"/>
               <w:left w:color="d9d9d9" w:space="0" w:sz="4" w:val="single"/>
@@ -2508,10 +2583,11 @@
               <w:bottom w:w="100.0" w:type="dxa"/>
               <w:right w:w="100.0" w:type="dxa"/>
             </w:tcMar>
-            <w:vAlign w:val="top"/>
-          </w:tcPr>
-          <w:p>
-            <w:pPr>
+            <w:vAlign w:val="center"/>
+          </w:tcPr>
+          <w:p>
+            <w:pPr>
+              <w:jc w:val="center"/>
               <w:rPr>
                 <w:rFonts w:ascii="Times New Roman" w:cs="Times New Roman" w:eastAsia="Times New Roman" w:hAnsi="Times New Roman"/>
                 <w:sz w:val="24"/>
@@ -2537,10 +2613,11 @@
               <w:bottom w:w="100.0" w:type="dxa"/>
               <w:right w:w="100.0" w:type="dxa"/>
             </w:tcMar>
-            <w:vAlign w:val="top"/>
-          </w:tcPr>
-          <w:p>
-            <w:pPr>
+            <w:vAlign w:val="center"/>
+          </w:tcPr>
+          <w:p>
+            <w:pPr>
+              <w:jc w:val="center"/>
               <w:rPr>
                 <w:rFonts w:ascii="Times New Roman" w:cs="Times New Roman" w:eastAsia="Times New Roman" w:hAnsi="Times New Roman"/>
                 <w:sz w:val="24"/>
@@ -2589,46 +2666,14 @@
           <w:tcPr>
             <w:tcBorders>
               <w:top w:color="d9d9d9" w:space="0" w:sz="4" w:val="single"/>
+              <w:right w:color="d9d9d9" w:space="0" w:sz="4" w:val="single"/>
             </w:tcBorders>
-            <w:shd w:fill="ffffff" w:val="clear"/>
             <w:vAlign w:val="center"/>
           </w:tcPr>
           <w:p>
             <w:pPr>
               <w:shd w:fill="ffffff" w:val="clear"/>
               <w:spacing w:line="240" w:lineRule="auto"/>
-              <w:jc w:val="center"/>
-              <w:rPr>
-                <w:rFonts w:ascii="Times New Roman" w:cs="Times New Roman" w:eastAsia="Times New Roman" w:hAnsi="Times New Roman"/>
-                <w:sz w:val="24"/>
-                <w:szCs w:val="24"/>
-              </w:rPr>
-            </w:pPr>
-            <w:r>
-              <w:rPr>
-                <w:rFonts w:ascii="Times New Roman" w:cs="Times New Roman" w:eastAsia="Times New Roman" w:hAnsi="Times New Roman"/>
-                <w:sz w:val="24"/>
-                <w:szCs w:val="24"/>
-                <w:rtl w:val="0"/>
-              </w:rPr>
-              <w:t xml:space="preserve">{{ lesson.group_results }}</w:t>
-            </w:r>
-          </w:p>
-        </w:tc>
-        <w:tc>
-          <w:tcPr>
-            <w:tcBorders>
-              <w:top w:color="d9d9d9" w:space="0" w:sz="4" w:val="single"/>
-              <w:right w:color="d9d9d9" w:space="0" w:sz="4" w:val="single"/>
-            </w:tcBorders>
-            <w:shd w:fill="ffffff" w:val="clear"/>
-            <w:vAlign w:val="center"/>
-          </w:tcPr>
-          <w:p>
-            <w:pPr>
-              <w:shd w:fill="ffffff" w:val="clear"/>
-              <w:spacing w:line="240" w:lineRule="auto"/>
-              <w:jc w:val="center"/>
               <w:rPr>
                 <w:rFonts w:ascii="Times New Roman" w:cs="Times New Roman" w:eastAsia="Times New Roman" w:hAnsi="Times New Roman"/>
                 <w:sz w:val="24"/>
@@ -2655,7 +2700,7 @@
         </w:trPr>
         <w:tc>
           <w:tcPr>
-            <w:gridSpan w:val="5"/>
+            <w:gridSpan w:val="4"/>
             <w:shd w:fill="auto" w:val="clear"/>
             <w:tcMar>
               <w:top w:w="100.0" w:type="dxa"/>
@@ -2693,7 +2738,7 @@
         </w:trPr>
         <w:tc>
           <w:tcPr>
-            <w:gridSpan w:val="5"/>
+            <w:gridSpan w:val="4"/>
             <w:shd w:fill="auto" w:val="clear"/>
             <w:tcMar>
               <w:top w:w="100.0" w:type="dxa"/>
@@ -2731,7 +2776,7 @@
         </w:trPr>
         <w:tc>
           <w:tcPr>
-            <w:gridSpan w:val="5"/>
+            <w:gridSpan w:val="4"/>
             <w:shd w:fill="auto" w:val="clear"/>
             <w:tcMar>
               <w:top w:w="100.0" w:type="dxa"/>
@@ -2947,6 +2992,20 @@
   <w:style w:type="paragraph" w:styleId="Normal" w:default="1">
     <w:name w:val="normal"/>
   </w:style>
+  <w:style w:type="table" w:styleId="TableNormal" w:default="1">
+    <w:name w:val="TableNormal"/>
+    <w:tblPr>
+      <w:tblCellMar>
+        <w:top w:w="100.0" w:type="dxa"/>
+        <w:left w:w="100.0" w:type="dxa"/>
+        <w:bottom w:w="100.0" w:type="dxa"/>
+        <w:right w:w="100.0" w:type="dxa"/>
+      </w:tblCellMar>
+    </w:tblPr>
+  </w:style>
+  <w:style w:type="paragraph" w:styleId="Normal" w:default="1">
+    <w:name w:val="normal"/>
+  </w:style>
   <w:style w:type="table" w:styleId="Table1">
     <w:basedOn w:val="TableNormal"/>
     <w:tblPr>
@@ -3004,6 +3063,150 @@
       <w:tblStyleRowBandSize w:val="1"/>
       <w:tblStyleColBandSize w:val="1"/>
       <w:tblCellMar/>
+    </w:tblPr>
+    <w:tblStylePr w:type="band1Horz">
+      <w:tcPr/>
+    </w:tblStylePr>
+    <w:tblStylePr w:type="band1Vert">
+      <w:tcPr/>
+    </w:tblStylePr>
+    <w:tblStylePr w:type="band2Horz">
+      <w:tcPr/>
+    </w:tblStylePr>
+    <w:tblStylePr w:type="band2Vert">
+      <w:tcPr/>
+    </w:tblStylePr>
+    <w:tblStylePr w:type="firstCol">
+      <w:tcPr/>
+    </w:tblStylePr>
+    <w:tblStylePr w:type="firstRow">
+      <w:tcPr/>
+    </w:tblStylePr>
+    <w:tblStylePr w:type="lastCol">
+      <w:tcPr/>
+    </w:tblStylePr>
+    <w:tblStylePr w:type="lastRow">
+      <w:tcPr/>
+    </w:tblStylePr>
+    <w:tblStylePr w:type="neCell">
+      <w:tcPr/>
+    </w:tblStylePr>
+    <w:tblStylePr w:type="nwCell">
+      <w:tcPr/>
+    </w:tblStylePr>
+    <w:tblStylePr w:type="seCell">
+      <w:tcPr/>
+    </w:tblStylePr>
+    <w:tblStylePr w:type="swCell">
+      <w:tcPr/>
+    </w:tblStylePr>
+  </w:style>
+  <w:style w:type="table" w:styleId="Table1">
+    <w:basedOn w:val="TableNormal"/>
+    <w:tblPr>
+      <w:tblStyleRowBandSize w:val="1"/>
+      <w:tblStyleColBandSize w:val="1"/>
+    </w:tblPr>
+  </w:style>
+  <w:style w:type="table" w:styleId="Table2">
+    <w:basedOn w:val="TableNormal"/>
+    <w:tblPr>
+      <w:tblStyleRowBandSize w:val="1"/>
+      <w:tblStyleColBandSize w:val="1"/>
+      <w:tblCellMar/>
+    </w:tblPr>
+    <w:tblStylePr w:type="band1Horz">
+      <w:tcPr/>
+    </w:tblStylePr>
+    <w:tblStylePr w:type="band1Vert">
+      <w:tcPr/>
+    </w:tblStylePr>
+    <w:tblStylePr w:type="band2Horz">
+      <w:tcPr/>
+    </w:tblStylePr>
+    <w:tblStylePr w:type="band2Vert">
+      <w:tcPr/>
+    </w:tblStylePr>
+    <w:tblStylePr w:type="firstCol">
+      <w:tcPr/>
+    </w:tblStylePr>
+    <w:tblStylePr w:type="firstRow">
+      <w:tcPr/>
+    </w:tblStylePr>
+    <w:tblStylePr w:type="lastCol">
+      <w:tcPr/>
+    </w:tblStylePr>
+    <w:tblStylePr w:type="lastRow">
+      <w:tcPr/>
+    </w:tblStylePr>
+    <w:tblStylePr w:type="neCell">
+      <w:tcPr/>
+    </w:tblStylePr>
+    <w:tblStylePr w:type="nwCell">
+      <w:tcPr/>
+    </w:tblStylePr>
+    <w:tblStylePr w:type="seCell">
+      <w:tcPr/>
+    </w:tblStylePr>
+    <w:tblStylePr w:type="swCell">
+      <w:tcPr/>
+    </w:tblStylePr>
+  </w:style>
+  <w:style w:type="table" w:styleId="Table3">
+    <w:basedOn w:val="TableNormal"/>
+    <w:tblPr>
+      <w:tblStyleRowBandSize w:val="1"/>
+      <w:tblStyleColBandSize w:val="1"/>
+      <w:tblCellMar/>
+    </w:tblPr>
+    <w:tblStylePr w:type="band1Horz">
+      <w:tcPr/>
+    </w:tblStylePr>
+    <w:tblStylePr w:type="band1Vert">
+      <w:tcPr/>
+    </w:tblStylePr>
+    <w:tblStylePr w:type="band2Horz">
+      <w:tcPr/>
+    </w:tblStylePr>
+    <w:tblStylePr w:type="band2Vert">
+      <w:tcPr/>
+    </w:tblStylePr>
+    <w:tblStylePr w:type="firstCol">
+      <w:tcPr/>
+    </w:tblStylePr>
+    <w:tblStylePr w:type="firstRow">
+      <w:tcPr/>
+    </w:tblStylePr>
+    <w:tblStylePr w:type="lastCol">
+      <w:tcPr/>
+    </w:tblStylePr>
+    <w:tblStylePr w:type="lastRow">
+      <w:tcPr/>
+    </w:tblStylePr>
+    <w:tblStylePr w:type="neCell">
+      <w:tcPr/>
+    </w:tblStylePr>
+    <w:tblStylePr w:type="nwCell">
+      <w:tcPr/>
+    </w:tblStylePr>
+    <w:tblStylePr w:type="seCell">
+      <w:tcPr/>
+    </w:tblStylePr>
+    <w:tblStylePr w:type="swCell">
+      <w:tcPr/>
+    </w:tblStylePr>
+  </w:style>
+  <w:style w:type="table" w:styleId="Table4">
+    <w:basedOn w:val="TableNormal"/>
+    <w:tblPr>
+      <w:tblStyleRowBandSize w:val="1"/>
+      <w:tblStyleColBandSize w:val="1"/>
+      <w:tblCellMar>
+        <w:top w:w="0.0" w:type="dxa"/>
+        <w:left w:w="115.0" w:type="dxa"/>
+        <w:bottom w:w="0.0" w:type="dxa"/>
+        <w:right w:w="115.0" w:type="dxa"/>
+      </w:tblCellMar>
     </w:tblPr>
     <w:tblStylePr w:type="band1Horz">
       <w:tcPr/>
@@ -3073,88 +3276,14 @@
     <w:tblPr>
       <w:tblStyleRowBandSize w:val="1"/>
       <w:tblStyleColBandSize w:val="1"/>
-      <w:tblCellMar/>
     </w:tblPr>
-    <w:tblStylePr w:type="band1Horz">
-      <w:tcPr/>
-    </w:tblStylePr>
-    <w:tblStylePr w:type="band1Vert">
-      <w:tcPr/>
-    </w:tblStylePr>
-    <w:tblStylePr w:type="band2Horz">
-      <w:tcPr/>
-    </w:tblStylePr>
-    <w:tblStylePr w:type="band2Vert">
-      <w:tcPr/>
-    </w:tblStylePr>
-    <w:tblStylePr w:type="firstCol">
-      <w:tcPr/>
-    </w:tblStylePr>
-    <w:tblStylePr w:type="firstRow">
-      <w:tcPr/>
-    </w:tblStylePr>
-    <w:tblStylePr w:type="lastCol">
-      <w:tcPr/>
-    </w:tblStylePr>
-    <w:tblStylePr w:type="lastRow">
-      <w:tcPr/>
-    </w:tblStylePr>
-    <w:tblStylePr w:type="neCell">
-      <w:tcPr/>
-    </w:tblStylePr>
-    <w:tblStylePr w:type="nwCell">
-      <w:tcPr/>
-    </w:tblStylePr>
-    <w:tblStylePr w:type="seCell">
-      <w:tcPr/>
-    </w:tblStylePr>
-    <w:tblStylePr w:type="swCell">
-      <w:tcPr/>
-    </w:tblStylePr>
   </w:style>
   <w:style w:type="table" w:styleId="Table3">
     <w:basedOn w:val="TableNormal"/>
     <w:tblPr>
       <w:tblStyleRowBandSize w:val="1"/>
       <w:tblStyleColBandSize w:val="1"/>
-      <w:tblCellMar/>
     </w:tblPr>
-    <w:tblStylePr w:type="band1Horz">
-      <w:tcPr/>
-    </w:tblStylePr>
-    <w:tblStylePr w:type="band1Vert">
-      <w:tcPr/>
-    </w:tblStylePr>
-    <w:tblStylePr w:type="band2Horz">
-      <w:tcPr/>
-    </w:tblStylePr>
-    <w:tblStylePr w:type="band2Vert">
-      <w:tcPr/>
-    </w:tblStylePr>
-    <w:tblStylePr w:type="firstCol">
-      <w:tcPr/>
-    </w:tblStylePr>
-    <w:tblStylePr w:type="firstRow">
-      <w:tcPr/>
-    </w:tblStylePr>
-    <w:tblStylePr w:type="lastCol">
-      <w:tcPr/>
-    </w:tblStylePr>
-    <w:tblStylePr w:type="lastRow">
-      <w:tcPr/>
-    </w:tblStylePr>
-    <w:tblStylePr w:type="neCell">
-      <w:tcPr/>
-    </w:tblStylePr>
-    <w:tblStylePr w:type="nwCell">
-      <w:tcPr/>
-    </w:tblStylePr>
-    <w:tblStylePr w:type="seCell">
-      <w:tcPr/>
-    </w:tblStylePr>
-    <w:tblStylePr w:type="swCell">
-      <w:tcPr/>
-    </w:tblStylePr>
   </w:style>
   <w:style w:type="table" w:styleId="Table4">
     <w:basedOn w:val="TableNormal"/>
@@ -3168,42 +3297,6 @@
         <w:right w:w="115.0" w:type="dxa"/>
       </w:tblCellMar>
     </w:tblPr>
-    <w:tblStylePr w:type="band1Horz">
-      <w:tcPr/>
-    </w:tblStylePr>
-    <w:tblStylePr w:type="band1Vert">
-      <w:tcPr/>
-    </w:tblStylePr>
-    <w:tblStylePr w:type="band2Horz">
-      <w:tcPr/>
-    </w:tblStylePr>
-    <w:tblStylePr w:type="band2Vert">
-      <w:tcPr/>
-    </w:tblStylePr>
-    <w:tblStylePr w:type="firstCol">
-      <w:tcPr/>
-    </w:tblStylePr>
-    <w:tblStylePr w:type="firstRow">
-      <w:tcPr/>
-    </w:tblStylePr>
-    <w:tblStylePr w:type="lastCol">
-      <w:tcPr/>
-    </w:tblStylePr>
-    <w:tblStylePr w:type="lastRow">
-      <w:tcPr/>
-    </w:tblStylePr>
-    <w:tblStylePr w:type="neCell">
-      <w:tcPr/>
-    </w:tblStylePr>
-    <w:tblStylePr w:type="nwCell">
-      <w:tcPr/>
-    </w:tblStylePr>
-    <w:tblStylePr w:type="seCell">
-      <w:tcPr/>
-    </w:tblStylePr>
-    <w:tblStylePr w:type="swCell">
-      <w:tcPr/>
-    </w:tblStylePr>
   </w:style>
 </w:styles>
 </file>
@@ -3530,7 +3623,7 @@
 
 <file path=customXML/item1.xml><?xml version="1.0" encoding="utf-8"?>
 <go:gDocsCustomXmlDataStorage xmlns:go="http://customooxmlschemas.google.com/" xmlns:r="http://schemas.openxmlformats.org/officeDocument/2006/relationships" uri="GoogleDocsCustomDataVersion2">
-  <go:docsCustomData xmlns:go="http://customooxmlschemas.google.com/" roundtripDataSignature="AMtx7mi6Yaodla8R8yFZ3YkuFzUs5ZYS+Q==">CgMxLjA4AHIhMTlVay1zOTBrczVmTDVHaC1OZ3R5OVdKMGtWT0lXbnY4</go:docsCustomData>
+  <go:docsCustomData xmlns:go="http://customooxmlschemas.google.com/" roundtripDataSignature="AMtx7mj5xDgWRxMGgx6ckMhx2e/uM9D3bg==">CgMxLjA4AHIhMTA5SGhBY1NYMmU2SFltWC1YSG9BQWdXNmVTZ1dmaEtZ</go:docsCustomData>
 </go:gDocsCustomXmlDataStorage>
 </file>
 

</xml_diff>